<commit_message>
redux js toolkit revision
</commit_message>
<xml_diff>
--- a/pics/react-redux.docx
+++ b/pics/react-redux.docx
@@ -3,6 +3,223 @@
 <w:document xmlns:wpc="http://schemas.microsoft.com/office/word/2010/wordprocessingCanvas" xmlns:cx="http://schemas.microsoft.com/office/drawing/2014/chartex" xmlns:cx1="http://schemas.microsoft.com/office/drawing/2015/9/8/chartex" xmlns:cx2="http://schemas.microsoft.com/office/drawing/2015/10/21/chartex" xmlns:cx3="http://schemas.microsoft.com/office/drawing/2016/5/9/chartex" xmlns:cx4="http://schemas.microsoft.com/office/drawing/2016/5/10/chartex" xmlns:cx5="http://schemas.microsoft.com/office/drawing/2016/5/11/chartex" xmlns:cx6="http://schemas.microsoft.com/office/drawing/2016/5/12/chartex" xmlns:cx7="http://schemas.microsoft.com/office/drawing/2016/5/13/chartex" xmlns:cx8="http://schemas.microsoft.com/office/drawing/2016/5/14/chartex" xmlns:mc="http://schemas.openxmlformats.org/markup-compatibility/2006" xmlns:aink="http://schemas.microsoft.com/office/drawing/2016/ink" xmlns:am3d="http://schemas.microsoft.com/office/drawing/2017/model3d" xmlns:o="urn:schemas-microsoft-com:office:office" xmlns:oel="http://schemas.microsoft.com/office/2019/extlst" xmlns:r="http://schemas.openxmlformats.org/officeDocument/2006/relationships" xmlns:m="http://schemas.openxmlformats.org/officeDocument/2006/math" xmlns:v="urn:schemas-microsoft-com:vml" xmlns:wp14="http://schemas.microsoft.com/office/word/2010/wordprocessingDrawing" xmlns:wp="http://schemas.openxmlformats.org/drawingml/2006/wordprocessingDrawing" xmlns:w10="urn:schemas-microsoft-com:office:word" xmlns:w="http://schemas.openxmlformats.org/wordprocessingml/2006/main" xmlns:w14="http://schemas.microsoft.com/office/word/2010/wordml" xmlns:w15="http://schemas.microsoft.com/office/word/2012/wordml" xmlns:w16cex="http://schemas.microsoft.com/office/word/2018/wordml/cex" xmlns:w16cid="http://schemas.microsoft.com/office/word/2016/wordml/cid" xmlns:w16="http://schemas.microsoft.com/office/word/2018/wordml" xmlns:w16du="http://schemas.microsoft.com/office/word/2023/wordml/word16du" xmlns:w16sdtdh="http://schemas.microsoft.com/office/word/2020/wordml/sdtdatahash" xmlns:w16sdtfl="http://schemas.microsoft.com/office/word/2024/wordml/sdtformatlock" xmlns:w16se="http://schemas.microsoft.com/office/word/2015/wordml/symex" xmlns:wpg="http://schemas.microsoft.com/office/word/2010/wordprocessingGroup" xmlns:wpi="http://schemas.microsoft.com/office/word/2010/wordprocessingInk" xmlns:wne="http://schemas.microsoft.com/office/word/2006/wordml" xmlns:wps="http://schemas.microsoft.com/office/word/2010/wordprocessingShape" mc:Ignorable="w14 w15 w16se w16cid w16 w16cex w16sdtdh w16sdtfl w16du wp14">
   <w:body>
     <w:p>
+      <w:r>
+        <w:rPr>
+          <w:noProof/>
+        </w:rPr>
+        <mc:AlternateContent>
+          <mc:Choice Requires="wps">
+            <w:drawing>
+              <wp:anchor distT="0" distB="0" distL="114300" distR="114300" simplePos="0" relativeHeight="251707392" behindDoc="0" locked="0" layoutInCell="1" allowOverlap="1" wp14:anchorId="590BB6A7" wp14:editId="60D89593">
+                <wp:simplePos x="0" y="0"/>
+                <wp:positionH relativeFrom="column">
+                  <wp:posOffset>4465955</wp:posOffset>
+                </wp:positionH>
+                <wp:positionV relativeFrom="paragraph">
+                  <wp:posOffset>630344</wp:posOffset>
+                </wp:positionV>
+                <wp:extent cx="537633" cy="160866"/>
+                <wp:effectExtent l="0" t="0" r="15240" b="10795"/>
+                <wp:wrapNone/>
+                <wp:docPr id="372042376" name="Text Box 35"/>
+                <wp:cNvGraphicFramePr/>
+                <a:graphic xmlns:a="http://schemas.openxmlformats.org/drawingml/2006/main">
+                  <a:graphicData uri="http://schemas.microsoft.com/office/word/2010/wordprocessingShape">
+                    <wps:wsp>
+                      <wps:cNvSpPr txBox="1"/>
+                      <wps:spPr>
+                        <a:xfrm>
+                          <a:off x="0" y="0"/>
+                          <a:ext cx="537633" cy="160866"/>
+                        </a:xfrm>
+                        <a:prstGeom prst="rect">
+                          <a:avLst/>
+                        </a:prstGeom>
+                        <a:solidFill>
+                          <a:schemeClr val="lt1"/>
+                        </a:solidFill>
+                        <a:ln w="6350">
+                          <a:solidFill>
+                            <a:prstClr val="black"/>
+                          </a:solidFill>
+                        </a:ln>
+                      </wps:spPr>
+                      <wps:txbx>
+                        <w:txbxContent>
+                          <w:p/>
+                        </w:txbxContent>
+                      </wps:txbx>
+                      <wps:bodyPr rot="0" spcFirstLastPara="0" vertOverflow="overflow" horzOverflow="overflow" vert="horz" wrap="square" lIns="91440" tIns="45720" rIns="91440" bIns="45720" numCol="1" spcCol="0" rtlCol="0" fromWordArt="0" anchor="t" anchorCtr="0" forceAA="0" compatLnSpc="1">
+                        <a:prstTxWarp prst="textNoShape">
+                          <a:avLst/>
+                        </a:prstTxWarp>
+                        <a:noAutofit/>
+                      </wps:bodyPr>
+                    </wps:wsp>
+                  </a:graphicData>
+                </a:graphic>
+              </wp:anchor>
+            </w:drawing>
+          </mc:Choice>
+          <mc:Fallback>
+            <w:pict>
+              <v:shapetype w14:anchorId="590BB6A7" id="_x0000_t202" coordsize="21600,21600" o:spt="202" path="m,l,21600r21600,l21600,xe">
+                <v:stroke joinstyle="miter"/>
+                <v:path gradientshapeok="t" o:connecttype="rect"/>
+              </v:shapetype>
+              <v:shape id="Text Box 35" o:spid="_x0000_s1026" type="#_x0000_t202" style="position:absolute;margin-left:351.65pt;margin-top:49.65pt;width:42.35pt;height:12.65pt;z-index:251707392;visibility:visible;mso-wrap-style:square;mso-wrap-distance-left:9pt;mso-wrap-distance-top:0;mso-wrap-distance-right:9pt;mso-wrap-distance-bottom:0;mso-position-horizontal:absolute;mso-position-horizontal-relative:text;mso-position-vertical:absolute;mso-position-vertical-relative:text;v-text-anchor:top" o:gfxdata="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" fillcolor="white [3201]" strokeweight=".5pt">
+                <v:textbox>
+                  <w:txbxContent>
+                    <w:p/>
+                  </w:txbxContent>
+                </v:textbox>
+              </v:shape>
+            </w:pict>
+          </mc:Fallback>
+        </mc:AlternateContent>
+      </w:r>
+      <w:r>
+        <w:rPr>
+          <w:noProof/>
+        </w:rPr>
+        <mc:AlternateContent>
+          <mc:Choice Requires="wps">
+            <w:drawing>
+              <wp:anchor distT="0" distB="0" distL="114300" distR="114300" simplePos="0" relativeHeight="251705344" behindDoc="0" locked="0" layoutInCell="1" allowOverlap="1" wp14:anchorId="32A000EB" wp14:editId="114D9FE2">
+                <wp:simplePos x="0" y="0"/>
+                <wp:positionH relativeFrom="column">
+                  <wp:posOffset>4457488</wp:posOffset>
+                </wp:positionH>
+                <wp:positionV relativeFrom="paragraph">
+                  <wp:posOffset>477309</wp:posOffset>
+                </wp:positionV>
+                <wp:extent cx="537633" cy="160866"/>
+                <wp:effectExtent l="0" t="0" r="15240" b="10795"/>
+                <wp:wrapNone/>
+                <wp:docPr id="1505386007" name="Text Box 35"/>
+                <wp:cNvGraphicFramePr/>
+                <a:graphic xmlns:a="http://schemas.openxmlformats.org/drawingml/2006/main">
+                  <a:graphicData uri="http://schemas.microsoft.com/office/word/2010/wordprocessingShape">
+                    <wps:wsp>
+                      <wps:cNvSpPr txBox="1"/>
+                      <wps:spPr>
+                        <a:xfrm>
+                          <a:off x="0" y="0"/>
+                          <a:ext cx="537633" cy="160866"/>
+                        </a:xfrm>
+                        <a:prstGeom prst="rect">
+                          <a:avLst/>
+                        </a:prstGeom>
+                        <a:solidFill>
+                          <a:schemeClr val="lt1"/>
+                        </a:solidFill>
+                        <a:ln w="6350">
+                          <a:solidFill>
+                            <a:prstClr val="black"/>
+                          </a:solidFill>
+                        </a:ln>
+                      </wps:spPr>
+                      <wps:txbx>
+                        <w:txbxContent>
+                          <w:p/>
+                        </w:txbxContent>
+                      </wps:txbx>
+                      <wps:bodyPr rot="0" spcFirstLastPara="0" vertOverflow="overflow" horzOverflow="overflow" vert="horz" wrap="square" lIns="91440" tIns="45720" rIns="91440" bIns="45720" numCol="1" spcCol="0" rtlCol="0" fromWordArt="0" anchor="t" anchorCtr="0" forceAA="0" compatLnSpc="1">
+                        <a:prstTxWarp prst="textNoShape">
+                          <a:avLst/>
+                        </a:prstTxWarp>
+                        <a:noAutofit/>
+                      </wps:bodyPr>
+                    </wps:wsp>
+                  </a:graphicData>
+                </a:graphic>
+              </wp:anchor>
+            </w:drawing>
+          </mc:Choice>
+          <mc:Fallback>
+            <w:pict>
+              <v:shape w14:anchorId="32A000EB" id="_x0000_s1027" type="#_x0000_t202" style="position:absolute;margin-left:351pt;margin-top:37.6pt;width:42.35pt;height:12.65pt;z-index:251705344;visibility:visible;mso-wrap-style:square;mso-wrap-distance-left:9pt;mso-wrap-distance-top:0;mso-wrap-distance-right:9pt;mso-wrap-distance-bottom:0;mso-position-horizontal:absolute;mso-position-horizontal-relative:text;mso-position-vertical:absolute;mso-position-vertical-relative:text;v-text-anchor:top" o:gfxdata="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" fillcolor="white [3201]" strokeweight=".5pt">
+                <v:textbox>
+                  <w:txbxContent>
+                    <w:p/>
+                  </w:txbxContent>
+                </v:textbox>
+              </v:shape>
+            </w:pict>
+          </mc:Fallback>
+        </mc:AlternateContent>
+      </w:r>
+      <w:r>
+        <w:rPr>
+          <w:noProof/>
+        </w:rPr>
+        <mc:AlternateContent>
+          <mc:Choice Requires="wps">
+            <w:drawing>
+              <wp:anchor distT="0" distB="0" distL="114300" distR="114300" simplePos="0" relativeHeight="251703296" behindDoc="0" locked="0" layoutInCell="1" allowOverlap="1" wp14:anchorId="2E689BDB" wp14:editId="1E762948">
+                <wp:simplePos x="0" y="0"/>
+                <wp:positionH relativeFrom="column">
+                  <wp:posOffset>4457700</wp:posOffset>
+                </wp:positionH>
+                <wp:positionV relativeFrom="paragraph">
+                  <wp:posOffset>313267</wp:posOffset>
+                </wp:positionV>
+                <wp:extent cx="537633" cy="160866"/>
+                <wp:effectExtent l="0" t="0" r="15240" b="10795"/>
+                <wp:wrapNone/>
+                <wp:docPr id="1991954424" name="Text Box 35"/>
+                <wp:cNvGraphicFramePr/>
+                <a:graphic xmlns:a="http://schemas.openxmlformats.org/drawingml/2006/main">
+                  <a:graphicData uri="http://schemas.microsoft.com/office/word/2010/wordprocessingShape">
+                    <wps:wsp>
+                      <wps:cNvSpPr txBox="1"/>
+                      <wps:spPr>
+                        <a:xfrm>
+                          <a:off x="0" y="0"/>
+                          <a:ext cx="537633" cy="160866"/>
+                        </a:xfrm>
+                        <a:prstGeom prst="rect">
+                          <a:avLst/>
+                        </a:prstGeom>
+                        <a:solidFill>
+                          <a:schemeClr val="lt1"/>
+                        </a:solidFill>
+                        <a:ln w="6350">
+                          <a:solidFill>
+                            <a:prstClr val="black"/>
+                          </a:solidFill>
+                        </a:ln>
+                      </wps:spPr>
+                      <wps:txbx>
+                        <w:txbxContent>
+                          <w:p/>
+                        </w:txbxContent>
+                      </wps:txbx>
+                      <wps:bodyPr rot="0" spcFirstLastPara="0" vertOverflow="overflow" horzOverflow="overflow" vert="horz" wrap="square" lIns="91440" tIns="45720" rIns="91440" bIns="45720" numCol="1" spcCol="0" rtlCol="0" fromWordArt="0" anchor="t" anchorCtr="0" forceAA="0" compatLnSpc="1">
+                        <a:prstTxWarp prst="textNoShape">
+                          <a:avLst/>
+                        </a:prstTxWarp>
+                        <a:noAutofit/>
+                      </wps:bodyPr>
+                    </wps:wsp>
+                  </a:graphicData>
+                </a:graphic>
+              </wp:anchor>
+            </w:drawing>
+          </mc:Choice>
+          <mc:Fallback>
+            <w:pict>
+              <v:shape w14:anchorId="2E689BDB" id="_x0000_s1028" type="#_x0000_t202" style="position:absolute;margin-left:351pt;margin-top:24.65pt;width:42.35pt;height:12.65pt;z-index:251703296;visibility:visible;mso-wrap-style:square;mso-wrap-distance-left:9pt;mso-wrap-distance-top:0;mso-wrap-distance-right:9pt;mso-wrap-distance-bottom:0;mso-position-horizontal:absolute;mso-position-horizontal-relative:text;mso-position-vertical:absolute;mso-position-vertical-relative:text;v-text-anchor:top" o:gfxdata="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" fillcolor="white [3201]" strokeweight=".5pt">
+                <v:textbox>
+                  <w:txbxContent>
+                    <w:p/>
+                  </w:txbxContent>
+                </v:textbox>
+              </v:shape>
+            </w:pict>
+          </mc:Fallback>
+        </mc:AlternateContent>
+      </w:r>
       <w:r>
         <w:rPr>
           <w:noProof/>
@@ -72,7 +289,7 @@
           </mc:Choice>
           <mc:Fallback>
             <w:pict>
-              <v:rect w14:anchorId="48B886F0" id="Rectangle 34" o:spid="_x0000_s1026" style="position:absolute;margin-left:324.95pt;margin-top:69.65pt;width:182.65pt;height:58.55pt;z-index:251702272;visibility:visible;mso-wrap-style:square;mso-wrap-distance-left:9pt;mso-wrap-distance-top:0;mso-wrap-distance-right:9pt;mso-wrap-distance-bottom:0;mso-position-horizontal:absolute;mso-position-horizontal-relative:text;mso-position-vertical:absolute;mso-position-vertical-relative:text;v-text-anchor:middle" o:gfxdata="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" filled="f" strokecolor="black [3213]" strokeweight="1.5pt"/>
+              <v:rect w14:anchorId="4797A4CB" id="Rectangle 34" o:spid="_x0000_s1026" style="position:absolute;margin-left:324.95pt;margin-top:69.65pt;width:182.65pt;height:58.55pt;z-index:251702272;visibility:visible;mso-wrap-style:square;mso-wrap-distance-left:9pt;mso-wrap-distance-top:0;mso-wrap-distance-right:9pt;mso-wrap-distance-bottom:0;mso-position-horizontal:absolute;mso-position-horizontal-relative:text;mso-position-vertical:absolute;mso-position-vertical-relative:text;v-text-anchor:middle" o:gfxdata="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" filled="f" strokecolor="black [3213]" strokeweight="1.5pt"/>
             </w:pict>
           </mc:Fallback>
         </mc:AlternateContent>
@@ -146,7 +363,7 @@
           </mc:Choice>
           <mc:Fallback>
             <w:pict>
-              <v:rect w14:anchorId="31E17E08" id="Rectangle 34" o:spid="_x0000_s1026" style="position:absolute;margin-left:324.35pt;margin-top:11.8pt;width:182.65pt;height:58.55pt;z-index:251700224;visibility:visible;mso-wrap-style:square;mso-wrap-distance-left:9pt;mso-wrap-distance-top:0;mso-wrap-distance-right:9pt;mso-wrap-distance-bottom:0;mso-position-horizontal:absolute;mso-position-horizontal-relative:text;mso-position-vertical:absolute;mso-position-vertical-relative:text;v-text-anchor:middle" o:gfxdata="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" filled="f" strokecolor="black [3213]" strokeweight="1.5pt"/>
+              <v:rect w14:anchorId="1FE558A3" id="Rectangle 34" o:spid="_x0000_s1026" style="position:absolute;margin-left:324.35pt;margin-top:11.8pt;width:182.65pt;height:58.55pt;z-index:251700224;visibility:visible;mso-wrap-style:square;mso-wrap-distance-left:9pt;mso-wrap-distance-top:0;mso-wrap-distance-right:9pt;mso-wrap-distance-bottom:0;mso-position-horizontal:absolute;mso-position-horizontal-relative:text;mso-position-vertical:absolute;mso-position-vertical-relative:text;v-text-anchor:middle" o:gfxdata="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" filled="f" strokecolor="black [3213]" strokeweight="1.5pt"/>
             </w:pict>
           </mc:Fallback>
         </mc:AlternateContent>
@@ -248,7 +465,7 @@
               <v:shapetype w14:anchorId="68F434BF" id="_x0000_t132" coordsize="21600,21600" o:spt="132" path="m10800,qx,3391l,18209qy10800,21600,21600,18209l21600,3391qy10800,xem,3391nfqy10800,6782,21600,3391e">
                 <v:path o:extrusionok="f" gradientshapeok="t" o:connecttype="custom" o:connectlocs="10800,6782;10800,0;0,10800;10800,21600;21600,10800" o:connectangles="270,270,180,90,0" textboxrect="0,6782,21600,18209"/>
               </v:shapetype>
-              <v:shape id="Flowchart: Magnetic Disk 32" o:spid="_x0000_s1026" type="#_x0000_t132" style="position:absolute;margin-left:170.65pt;margin-top:-20pt;width:51.65pt;height:141.65pt;z-index:251698176;visibility:visible;mso-wrap-style:square;mso-wrap-distance-left:9pt;mso-wrap-distance-top:0;mso-wrap-distance-right:9pt;mso-wrap-distance-bottom:0;mso-position-horizontal:absolute;mso-position-horizontal-relative:text;mso-position-vertical:absolute;mso-position-vertical-relative:text;v-text-anchor:middle" o:gfxdata="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" fillcolor="#215e99 [2431]" strokecolor="#030e13 [484]" strokeweight="1.5pt">
+              <v:shape id="Flowchart: Magnetic Disk 32" o:spid="_x0000_s1029" type="#_x0000_t132" style="position:absolute;margin-left:170.65pt;margin-top:-20pt;width:51.65pt;height:141.65pt;z-index:251698176;visibility:visible;mso-wrap-style:square;mso-wrap-distance-left:9pt;mso-wrap-distance-top:0;mso-wrap-distance-right:9pt;mso-wrap-distance-bottom:0;mso-position-horizontal:absolute;mso-position-horizontal-relative:text;mso-position-vertical:absolute;mso-position-vertical-relative:text;v-text-anchor:middle" o:gfxdata="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" fillcolor="#215e99 [2431]" strokecolor="#030e13 [484]" strokeweight="1.5pt">
                 <v:stroke joinstyle="miter"/>
                 <v:textbox>
                   <w:txbxContent>
@@ -430,7 +647,7 @@
           </mc:Choice>
           <mc:Fallback>
             <w:pict>
-              <v:rect w14:anchorId="66417641" id="Rectangle 2" o:spid="_x0000_s1027" style="position:absolute;margin-left:430.65pt;margin-top:-34.95pt;width:68.65pt;height:49.35pt;z-index:251696128;visibility:visible;mso-wrap-style:square;mso-wrap-distance-left:9pt;mso-wrap-distance-top:0;mso-wrap-distance-right:9pt;mso-wrap-distance-bottom:0;mso-position-horizontal:absolute;mso-position-horizontal-relative:text;mso-position-vertical:absolute;mso-position-vertical-relative:text;v-text-anchor:middle" o:gfxdata="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" fillcolor="#0f4761 [2404]" strokecolor="#030e13 [484]" strokeweight="1.5pt">
+              <v:rect w14:anchorId="66417641" id="Rectangle 2" o:spid="_x0000_s1030" style="position:absolute;margin-left:430.65pt;margin-top:-34.95pt;width:68.65pt;height:49.35pt;z-index:251696128;visibility:visible;mso-wrap-style:square;mso-wrap-distance-left:9pt;mso-wrap-distance-top:0;mso-wrap-distance-right:9pt;mso-wrap-distance-bottom:0;mso-position-horizontal:absolute;mso-position-horizontal-relative:text;mso-position-vertical:absolute;mso-position-vertical-relative:text;v-text-anchor:middle" o:gfxdata="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" fillcolor="#0f4761 [2404]" strokecolor="#030e13 [484]" strokeweight="1.5pt">
                 <v:textbox>
                   <w:txbxContent>
                     <w:p>
@@ -605,7 +822,7 @@
           </mc:Choice>
           <mc:Fallback>
             <w:pict>
-              <v:roundrect w14:anchorId="7886A21F" id="Rectangle: Rounded Corners 14" o:spid="_x0000_s1028" style="position:absolute;margin-left:65.3pt;margin-top:1.35pt;width:89.65pt;height:32.65pt;z-index:251687936;visibility:visible;mso-wrap-style:square;mso-wrap-distance-left:9pt;mso-wrap-distance-top:0;mso-wrap-distance-right:9pt;mso-wrap-distance-bottom:0;mso-position-horizontal:absolute;mso-position-horizontal-relative:text;mso-position-vertical:absolute;mso-position-vertical-relative:text;v-text-anchor:middle" arcsize="10923f" o:gfxdata="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" fillcolor="#d86dcb [1944]" strokecolor="#030e13 [484]" strokeweight="1.5pt">
+              <v:roundrect w14:anchorId="7886A21F" id="Rectangle: Rounded Corners 14" o:spid="_x0000_s1031" style="position:absolute;margin-left:65.3pt;margin-top:1.35pt;width:89.65pt;height:32.65pt;z-index:251687936;visibility:visible;mso-wrap-style:square;mso-wrap-distance-left:9pt;mso-wrap-distance-top:0;mso-wrap-distance-right:9pt;mso-wrap-distance-bottom:0;mso-position-horizontal:absolute;mso-position-horizontal-relative:text;mso-position-vertical:absolute;mso-position-vertical-relative:text;v-text-anchor:middle" arcsize="10923f" o:gfxdata="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" fillcolor="#d86dcb [1944]" strokecolor="#030e13 [484]" strokeweight="1.5pt">
                 <v:stroke joinstyle="miter"/>
                 <v:textbox>
                   <w:txbxContent>
@@ -781,11 +998,7 @@
           </mc:Choice>
           <mc:Fallback>
             <w:pict>
-              <v:shapetype w14:anchorId="70E12E2E" id="_x0000_t202" coordsize="21600,21600" o:spt="202" path="m,l,21600r21600,l21600,xe">
-                <v:stroke joinstyle="miter"/>
-                <v:path gradientshapeok="t" o:connecttype="rect"/>
-              </v:shapetype>
-              <v:shape id="Text Box 15" o:spid="_x0000_s1029" type="#_x0000_t202" style="position:absolute;margin-left:71.3pt;margin-top:37.55pt;width:74.35pt;height:24.65pt;z-index:251688960;visibility:visible;mso-wrap-style:square;mso-width-percent:0;mso-height-percent:0;mso-wrap-distance-left:9pt;mso-wrap-distance-top:0;mso-wrap-distance-right:9pt;mso-wrap-distance-bottom:0;mso-position-horizontal:absolute;mso-position-horizontal-relative:text;mso-position-vertical:absolute;mso-position-vertical-relative:text;mso-width-percent:0;mso-height-percent:0;mso-width-relative:margin;mso-height-relative:margin;v-text-anchor:top" o:gfxdata="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" fillcolor="#215e99 [2431]" strokeweight=".5pt">
+              <v:shape w14:anchorId="70E12E2E" id="Text Box 15" o:spid="_x0000_s1032" type="#_x0000_t202" style="position:absolute;margin-left:71.3pt;margin-top:37.55pt;width:74.35pt;height:24.65pt;z-index:251688960;visibility:visible;mso-wrap-style:square;mso-width-percent:0;mso-height-percent:0;mso-wrap-distance-left:9pt;mso-wrap-distance-top:0;mso-wrap-distance-right:9pt;mso-wrap-distance-bottom:0;mso-position-horizontal:absolute;mso-position-horizontal-relative:text;mso-position-vertical:absolute;mso-position-vertical-relative:text;mso-width-percent:0;mso-height-percent:0;mso-width-relative:margin;mso-height-relative:margin;v-text-anchor:top" o:gfxdata="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" fillcolor="#215e99 [2431]" strokeweight=".5pt">
                 <v:textbox>
                   <w:txbxContent>
                     <w:p>
@@ -873,7 +1086,7 @@
           </mc:Choice>
           <mc:Fallback>
             <w:pict>
-              <v:shapetype w14:anchorId="6DE02729" id="_x0000_t32" coordsize="21600,21600" o:spt="32" o:oned="t" path="m,l21600,21600e" filled="f">
+              <v:shapetype w14:anchorId="5A21F0C9" id="_x0000_t32" coordsize="21600,21600" o:spt="32" o:oned="t" path="m,l21600,21600e" filled="f">
                 <v:path arrowok="t" fillok="f" o:connecttype="none"/>
                 <o:lock v:ext="edit" shapetype="t"/>
               </v:shapetype>
@@ -1229,7 +1442,7 @@
           </mc:Choice>
           <mc:Fallback>
             <w:pict>
-              <v:shape w14:anchorId="5FF3B7A7" id="Text Box 7" o:spid="_x0000_s1030" type="#_x0000_t202" style="position:absolute;margin-left:234pt;margin-top:146.35pt;width:204pt;height:23.65pt;z-index:251681792;visibility:visible;mso-wrap-style:square;mso-height-percent:0;mso-wrap-distance-left:9pt;mso-wrap-distance-top:0;mso-wrap-distance-right:9pt;mso-wrap-distance-bottom:0;mso-position-horizontal:absolute;mso-position-horizontal-relative:text;mso-position-vertical:absolute;mso-position-vertical-relative:text;mso-height-percent:0;mso-height-relative:margin;v-text-anchor:top" o:gfxdata="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" fillcolor="#393939 [814]" strokeweight=".5pt">
+              <v:shape w14:anchorId="5FF3B7A7" id="Text Box 7" o:spid="_x0000_s1033" type="#_x0000_t202" style="position:absolute;margin-left:234pt;margin-top:146.35pt;width:204pt;height:23.65pt;z-index:251681792;visibility:visible;mso-wrap-style:square;mso-height-percent:0;mso-wrap-distance-left:9pt;mso-wrap-distance-top:0;mso-wrap-distance-right:9pt;mso-wrap-distance-bottom:0;mso-position-horizontal:absolute;mso-position-horizontal-relative:text;mso-position-vertical:absolute;mso-position-vertical-relative:text;mso-height-percent:0;mso-height-relative:margin;v-text-anchor:top" o:gfxdata="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" fillcolor="#393939 [814]" strokeweight=".5pt">
                 <v:textbox>
                   <w:txbxContent>
                     <w:p>
@@ -1448,7 +1661,7 @@
           </mc:Choice>
           <mc:Fallback>
             <w:pict>
-              <v:shape w14:anchorId="747D10E1" id="Straight Arrow Connector 6" o:spid="_x0000_s1026" type="#_x0000_t32" style="position:absolute;margin-left:291.35pt;margin-top:-18.35pt;width:39.65pt;height:30pt;flip:y;z-index:251676672;visibility:visible;mso-wrap-style:square;mso-wrap-distance-left:9pt;mso-wrap-distance-top:0;mso-wrap-distance-right:9pt;mso-wrap-distance-bottom:0;mso-position-horizontal:absolute;mso-position-horizontal-relative:text;mso-position-vertical:absolute;mso-position-vertical-relative:text" o:gfxdata="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" strokecolor="black [3200]" strokeweight="1.5pt">
+              <v:shape w14:anchorId="37262D27" id="Straight Arrow Connector 6" o:spid="_x0000_s1026" type="#_x0000_t32" style="position:absolute;margin-left:291.35pt;margin-top:-18.35pt;width:39.65pt;height:30pt;flip:y;z-index:251676672;visibility:visible;mso-wrap-style:square;mso-wrap-distance-left:9pt;mso-wrap-distance-top:0;mso-wrap-distance-right:9pt;mso-wrap-distance-bottom:0;mso-position-horizontal:absolute;mso-position-horizontal-relative:text;mso-position-vertical:absolute;mso-position-vertical-relative:text" o:gfxdata="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" strokecolor="black [3200]" strokeweight="1.5pt">
                 <v:stroke endarrow="block" joinstyle="miter"/>
               </v:shape>
             </w:pict>
@@ -1630,7 +1843,7 @@
           </mc:Choice>
           <mc:Fallback>
             <w:pict>
-              <v:roundrect w14:anchorId="364593EC" id="Rectangle: Rounded Corners 5" o:spid="_x0000_s1031" style="position:absolute;margin-left:248.65pt;margin-top:-43pt;width:66.65pt;height:166pt;z-index:251675648;visibility:visible;mso-wrap-style:square;mso-wrap-distance-left:9pt;mso-wrap-distance-top:0;mso-wrap-distance-right:9pt;mso-wrap-distance-bottom:0;mso-position-horizontal:absolute;mso-position-horizontal-relative:text;mso-position-vertical:absolute;mso-position-vertical-relative:text;v-text-anchor:middle" arcsize="10923f" o:gfxdata="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" fillcolor="#47d459 [1942]" strokecolor="#030e13 [484]" strokeweight="1.5pt">
+              <v:roundrect w14:anchorId="364593EC" id="Rectangle: Rounded Corners 5" o:spid="_x0000_s1034" style="position:absolute;margin-left:248.65pt;margin-top:-43pt;width:66.65pt;height:166pt;z-index:251675648;visibility:visible;mso-wrap-style:square;mso-wrap-distance-left:9pt;mso-wrap-distance-top:0;mso-wrap-distance-right:9pt;mso-wrap-distance-bottom:0;mso-position-horizontal:absolute;mso-position-horizontal-relative:text;mso-position-vertical:absolute;mso-position-vertical-relative:text;v-text-anchor:middle" arcsize="10923f" o:gfxdata="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" fillcolor="#47d459 [1942]" strokecolor="#030e13 [484]" strokeweight="1.5pt">
                 <v:stroke joinstyle="miter"/>
                 <v:textbox>
                   <w:txbxContent>
@@ -1948,7 +2161,7 @@
         <mc:AlternateContent>
           <mc:Choice Requires="wps">
             <w:drawing>
-              <wp:anchor distT="0" distB="0" distL="114300" distR="114300" simplePos="0" relativeHeight="251669504" behindDoc="0" locked="0" layoutInCell="1" allowOverlap="1" wp14:anchorId="59693D45" wp14:editId="6C7023ED">
+              <wp:anchor distT="0" distB="0" distL="114300" distR="114300" simplePos="0" relativeHeight="251669504" behindDoc="0" locked="0" layoutInCell="1" allowOverlap="1" wp14:anchorId="59693D45" wp14:editId="6E70281B">
                 <wp:simplePos x="0" y="0"/>
                 <wp:positionH relativeFrom="column">
                   <wp:posOffset>4215977</wp:posOffset>
@@ -2022,7 +2235,7 @@
           </mc:Choice>
           <mc:Fallback>
             <w:pict>
-              <v:rect w14:anchorId="59693D45" id="Rectangle 3" o:spid="_x0000_s1032" style="position:absolute;margin-left:331.95pt;margin-top:69.95pt;width:79.35pt;height:49pt;z-index:251669504;visibility:visible;mso-wrap-style:square;mso-wrap-distance-left:9pt;mso-wrap-distance-top:0;mso-wrap-distance-right:9pt;mso-wrap-distance-bottom:0;mso-position-horizontal:absolute;mso-position-horizontal-relative:text;mso-position-vertical:absolute;mso-position-vertical-relative:text;v-text-anchor:middle" o:gfxdata="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" fillcolor="#4e95d9 [1631]" strokecolor="#030e13 [484]" strokeweight="1.5pt">
+              <v:rect w14:anchorId="59693D45" id="Rectangle 3" o:spid="_x0000_s1035" style="position:absolute;margin-left:331.95pt;margin-top:69.95pt;width:79.35pt;height:49pt;z-index:251669504;visibility:visible;mso-wrap-style:square;mso-wrap-distance-left:9pt;mso-wrap-distance-top:0;mso-wrap-distance-right:9pt;mso-wrap-distance-bottom:0;mso-position-horizontal:absolute;mso-position-horizontal-relative:text;mso-position-vertical:absolute;mso-position-vertical-relative:text;v-text-anchor:middle" o:gfxdata="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" fillcolor="#4e95d9 [1631]" strokecolor="#030e13 [484]" strokeweight="1.5pt">
                 <v:textbox>
                   <w:txbxContent>
                     <w:p>
@@ -2121,7 +2334,7 @@
           </mc:Choice>
           <mc:Fallback>
             <w:pict>
-              <v:rect w14:anchorId="668D3648" id="_x0000_s1033" style="position:absolute;margin-left:332.35pt;margin-top:15.35pt;width:79.35pt;height:49pt;z-index:251667456;visibility:visible;mso-wrap-style:square;mso-wrap-distance-left:9pt;mso-wrap-distance-top:0;mso-wrap-distance-right:9pt;mso-wrap-distance-bottom:0;mso-position-horizontal:absolute;mso-position-horizontal-relative:text;mso-position-vertical:absolute;mso-position-vertical-relative:text;v-text-anchor:middle" o:gfxdata="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" fillcolor="#4e95d9 [1631]" strokecolor="#030e13 [484]" strokeweight="1.5pt">
+              <v:rect w14:anchorId="668D3648" id="_x0000_s1036" style="position:absolute;margin-left:332.35pt;margin-top:15.35pt;width:79.35pt;height:49pt;z-index:251667456;visibility:visible;mso-wrap-style:square;mso-wrap-distance-left:9pt;mso-wrap-distance-top:0;mso-wrap-distance-right:9pt;mso-wrap-distance-bottom:0;mso-position-horizontal:absolute;mso-position-horizontal-relative:text;mso-position-vertical:absolute;mso-position-vertical-relative:text;v-text-anchor:middle" o:gfxdata="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" fillcolor="#4e95d9 [1631]" strokecolor="#030e13 [484]" strokeweight="1.5pt">
                 <v:textbox>
                   <w:txbxContent>
                     <w:p>
@@ -2260,7 +2473,7 @@
           </mc:Choice>
           <mc:Fallback>
             <w:pict>
-              <v:rect w14:anchorId="0178C436" id="_x0000_s1034" style="position:absolute;margin-left:332pt;margin-top:-40.35pt;width:79.35pt;height:49pt;z-index:251665408;visibility:visible;mso-wrap-style:square;mso-wrap-distance-left:9pt;mso-wrap-distance-top:0;mso-wrap-distance-right:9pt;mso-wrap-distance-bottom:0;mso-position-horizontal:absolute;mso-position-horizontal-relative:text;mso-position-vertical:absolute;mso-position-vertical-relative:text;v-text-anchor:middle" o:gfxdata="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" fillcolor="#4e95d9 [1631]" strokecolor="#030e13 [484]" strokeweight="1.5pt">
+              <v:rect w14:anchorId="0178C436" id="_x0000_s1037" style="position:absolute;margin-left:332pt;margin-top:-40.35pt;width:79.35pt;height:49pt;z-index:251665408;visibility:visible;mso-wrap-style:square;mso-wrap-distance-left:9pt;mso-wrap-distance-top:0;mso-wrap-distance-right:9pt;mso-wrap-distance-bottom:0;mso-position-horizontal:absolute;mso-position-horizontal-relative:text;mso-position-vertical:absolute;mso-position-vertical-relative:text;v-text-anchor:middle" o:gfxdata="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" fillcolor="#4e95d9 [1631]" strokecolor="#030e13 [484]" strokeweight="1.5pt">
                 <v:textbox>
                   <w:txbxContent>
                     <w:p>
@@ -2396,7 +2609,7 @@
           </mc:Choice>
           <mc:Fallback>
             <w:pict>
-              <v:rect w14:anchorId="22673463" id="_x0000_s1035" style="position:absolute;margin-left:419.3pt;margin-top:70.65pt;width:68.65pt;height:49.35pt;z-index:251664384;visibility:visible;mso-wrap-style:square;mso-wrap-distance-left:9pt;mso-wrap-distance-top:0;mso-wrap-distance-right:9pt;mso-wrap-distance-bottom:0;mso-position-horizontal:absolute;mso-position-horizontal-relative:text;mso-position-vertical:absolute;mso-position-vertical-relative:text;v-text-anchor:middle" o:gfxdata="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" fillcolor="#f1a983 [1941]" strokecolor="#030e13 [484]" strokeweight="1.5pt">
+              <v:rect w14:anchorId="22673463" id="_x0000_s1038" style="position:absolute;margin-left:419.3pt;margin-top:70.65pt;width:68.65pt;height:49.35pt;z-index:251664384;visibility:visible;mso-wrap-style:square;mso-wrap-distance-left:9pt;mso-wrap-distance-top:0;mso-wrap-distance-right:9pt;mso-wrap-distance-bottom:0;mso-position-horizontal:absolute;mso-position-horizontal-relative:text;mso-position-vertical:absolute;mso-position-vertical-relative:text;v-text-anchor:middle" o:gfxdata="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" fillcolor="#f1a983 [1941]" strokecolor="#030e13 [484]" strokeweight="1.5pt">
                 <v:textbox>
                   <w:txbxContent>
                     <w:p>
@@ -2489,7 +2702,7 @@
           </mc:Choice>
           <mc:Fallback>
             <w:pict>
-              <v:rect w14:anchorId="0C88E6F5" id="_x0000_s1036" style="position:absolute;margin-left:419.3pt;margin-top:16.05pt;width:68.65pt;height:49.35pt;z-index:251662336;visibility:visible;mso-wrap-style:square;mso-wrap-distance-left:9pt;mso-wrap-distance-top:0;mso-wrap-distance-right:9pt;mso-wrap-distance-bottom:0;mso-position-horizontal:absolute;mso-position-horizontal-relative:text;mso-position-vertical:absolute;mso-position-vertical-relative:text;v-text-anchor:middle" o:gfxdata="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" fillcolor="#f1a983 [1941]" strokecolor="#030e13 [484]" strokeweight="1.5pt">
+              <v:rect w14:anchorId="0C88E6F5" id="_x0000_s1039" style="position:absolute;margin-left:419.3pt;margin-top:16.05pt;width:68.65pt;height:49.35pt;z-index:251662336;visibility:visible;mso-wrap-style:square;mso-wrap-distance-left:9pt;mso-wrap-distance-top:0;mso-wrap-distance-right:9pt;mso-wrap-distance-bottom:0;mso-position-horizontal:absolute;mso-position-horizontal-relative:text;mso-position-vertical:absolute;mso-position-vertical-relative:text;v-text-anchor:middle" o:gfxdata="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" fillcolor="#f1a983 [1941]" strokecolor="#030e13 [484]" strokeweight="1.5pt">
                 <v:textbox>
                   <w:txbxContent>
                     <w:p>
@@ -2585,7 +2798,7 @@
           </mc:Choice>
           <mc:Fallback>
             <w:pict>
-              <v:rect w14:anchorId="632BCAB0" id="_x0000_s1037" style="position:absolute;margin-left:419.3pt;margin-top:-39.35pt;width:68.65pt;height:49.35pt;z-index:251660288;visibility:visible;mso-wrap-style:square;mso-wrap-distance-left:9pt;mso-wrap-distance-top:0;mso-wrap-distance-right:9pt;mso-wrap-distance-bottom:0;mso-position-horizontal:absolute;mso-position-horizontal-relative:text;mso-position-vertical:absolute;mso-position-vertical-relative:text;v-text-anchor:middle" o:gfxdata="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" fillcolor="#47d459 [1942]" strokecolor="#030e13 [484]" strokeweight="1.5pt">
+              <v:rect w14:anchorId="632BCAB0" id="_x0000_s1040" style="position:absolute;margin-left:419.3pt;margin-top:-39.35pt;width:68.65pt;height:49.35pt;z-index:251660288;visibility:visible;mso-wrap-style:square;mso-wrap-distance-left:9pt;mso-wrap-distance-top:0;mso-wrap-distance-right:9pt;mso-wrap-distance-bottom:0;mso-position-horizontal:absolute;mso-position-horizontal-relative:text;mso-position-vertical:absolute;mso-position-vertical-relative:text;v-text-anchor:middle" o:gfxdata="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" fillcolor="#47d459 [1942]" strokecolor="#030e13 [484]" strokeweight="1.5pt">
                 <v:textbox>
                   <w:txbxContent>
                     <w:p>
@@ -3087,7 +3300,7 @@
   <w:style w:type="paragraph" w:default="1" w:styleId="Normal">
     <w:name w:val="Normal"/>
     <w:qFormat/>
-    <w:rsid w:val="00C72125"/>
+    <w:rsid w:val="00AD4064"/>
   </w:style>
   <w:style w:type="paragraph" w:styleId="Heading1">
     <w:name w:val="heading 1"/>

</xml_diff>